<commit_message>
Nota BIO 043: inclui matrículas das permutas 5 a 13
Co-Authored-By: Claude Opus 5.5 <noreply@anthropic.com>
Claude-Session: https://claude.ai/code/session_01GBJJsbRdYsz5ZmpVm2RRud
</commit_message>
<xml_diff>
--- a/notas_bio/Nota_Bio-CPOI_N_043_30.10.2026.docx
+++ b/notas_bio/Nota_Bio-CPOI_N_043_30.10.2026.docx
@@ -1730,7 +1730,7 @@
                 <w:szCs w:val="14"/>
                 <w:rtl w:val="0"/>
               </w:rPr>
-              <w:t xml:space="preserve"/>
+              <w:t xml:space="preserve">92.048.975</w:t>
             </w:r>
           </w:p>
         </w:tc>
@@ -1796,7 +1796,7 @@
                 <w:szCs w:val="14"/>
                 <w:rtl w:val="0"/>
               </w:rPr>
-              <w:t xml:space="preserve"/>
+              <w:t xml:space="preserve">92.048.975</w:t>
             </w:r>
           </w:p>
         </w:tc>
@@ -1893,7 +1893,7 @@
                 <w:szCs w:val="14"/>
                 <w:rtl w:val="0"/>
               </w:rPr>
-              <w:t xml:space="preserve"/>
+              <w:t xml:space="preserve">92.049.876</w:t>
             </w:r>
           </w:p>
         </w:tc>
@@ -1959,7 +1959,7 @@
                 <w:szCs w:val="14"/>
                 <w:rtl w:val="0"/>
               </w:rPr>
-              <w:t xml:space="preserve"/>
+              <w:t xml:space="preserve">92.049.876</w:t>
             </w:r>
           </w:p>
         </w:tc>
@@ -2056,7 +2056,7 @@
                 <w:szCs w:val="14"/>
                 <w:rtl w:val="0"/>
               </w:rPr>
-              <w:t xml:space="preserve"/>
+              <w:t xml:space="preserve">92.110.940</w:t>
             </w:r>
           </w:p>
         </w:tc>
@@ -2122,7 +2122,7 @@
                 <w:szCs w:val="14"/>
                 <w:rtl w:val="0"/>
               </w:rPr>
-              <w:t xml:space="preserve"/>
+              <w:t xml:space="preserve">92.110.940</w:t>
             </w:r>
           </w:p>
         </w:tc>
@@ -2219,7 +2219,7 @@
                 <w:szCs w:val="14"/>
                 <w:rtl w:val="0"/>
               </w:rPr>
-              <w:t xml:space="preserve"/>
+              <w:t xml:space="preserve">92.110.940</w:t>
             </w:r>
           </w:p>
         </w:tc>
@@ -2285,7 +2285,7 @@
                 <w:szCs w:val="14"/>
                 <w:rtl w:val="0"/>
               </w:rPr>
-              <w:t xml:space="preserve"/>
+              <w:t xml:space="preserve">92.110.940</w:t>
             </w:r>
           </w:p>
         </w:tc>
@@ -2382,7 +2382,7 @@
                 <w:szCs w:val="14"/>
                 <w:rtl w:val="0"/>
               </w:rPr>
-              <w:t xml:space="preserve"/>
+              <w:t xml:space="preserve">92.077.665</w:t>
             </w:r>
           </w:p>
         </w:tc>
@@ -2448,7 +2448,7 @@
                 <w:szCs w:val="14"/>
                 <w:rtl w:val="0"/>
               </w:rPr>
-              <w:t xml:space="preserve"/>
+              <w:t xml:space="preserve">92.077.665</w:t>
             </w:r>
           </w:p>
         </w:tc>
@@ -2545,7 +2545,7 @@
                 <w:szCs w:val="14"/>
                 <w:rtl w:val="0"/>
               </w:rPr>
-              <w:t xml:space="preserve"/>
+              <w:t xml:space="preserve">92.077.665</w:t>
             </w:r>
           </w:p>
         </w:tc>
@@ -2611,7 +2611,7 @@
                 <w:szCs w:val="14"/>
                 <w:rtl w:val="0"/>
               </w:rPr>
-              <w:t xml:space="preserve"/>
+              <w:t xml:space="preserve">92.077.665</w:t>
             </w:r>
           </w:p>
         </w:tc>
@@ -2708,7 +2708,7 @@
                 <w:szCs w:val="14"/>
                 <w:rtl w:val="0"/>
               </w:rPr>
-              <w:t xml:space="preserve"/>
+              <w:t xml:space="preserve">92.077.665</w:t>
             </w:r>
           </w:p>
         </w:tc>
@@ -2774,7 +2774,7 @@
                 <w:szCs w:val="14"/>
                 <w:rtl w:val="0"/>
               </w:rPr>
-              <w:t xml:space="preserve"/>
+              <w:t xml:space="preserve">92.077.665</w:t>
             </w:r>
           </w:p>
         </w:tc>
@@ -2871,7 +2871,7 @@
                 <w:szCs w:val="14"/>
                 <w:rtl w:val="0"/>
               </w:rPr>
-              <w:t xml:space="preserve"/>
+              <w:t xml:space="preserve">92.077.665</w:t>
             </w:r>
           </w:p>
         </w:tc>
@@ -2937,7 +2937,7 @@
                 <w:szCs w:val="14"/>
                 <w:rtl w:val="0"/>
               </w:rPr>
-              <w:t xml:space="preserve"/>
+              <w:t xml:space="preserve">92.077.665</w:t>
             </w:r>
           </w:p>
         </w:tc>
@@ -3034,7 +3034,7 @@
                 <w:szCs w:val="14"/>
                 <w:rtl w:val="0"/>
               </w:rPr>
-              <w:t xml:space="preserve"/>
+              <w:t xml:space="preserve">92.077.962</w:t>
             </w:r>
           </w:p>
         </w:tc>
@@ -3100,7 +3100,7 @@
                 <w:szCs w:val="14"/>
                 <w:rtl w:val="0"/>
               </w:rPr>
-              <w:t xml:space="preserve"/>
+              <w:t xml:space="preserve">92.077.962</w:t>
             </w:r>
           </w:p>
         </w:tc>

</xml_diff>

<commit_message>
Nota BIO 043: corrige matrículas dos substitutos
Co-Authored-By: Claude Opus 5.5 <noreply@anthropic.com>
Claude-Session: https://claude.ai/code/session_01GBJJsbRdYsz5ZmpVm2RRud
</commit_message>
<xml_diff>
--- a/notas_bio/Nota_Bio-CPOI_N_043_30.10.2026.docx
+++ b/notas_bio/Nota_Bio-CPOI_N_043_30.10.2026.docx
@@ -1730,7 +1730,7 @@
                 <w:szCs w:val="14"/>
                 <w:rtl w:val="0"/>
               </w:rPr>
-              <w:t xml:space="preserve">92.048.975</w:t>
+              <w:t>92.048.975</w:t>
             </w:r>
           </w:p>
         </w:tc>
@@ -1796,7 +1796,7 @@
                 <w:szCs w:val="14"/>
                 <w:rtl w:val="0"/>
               </w:rPr>
-              <w:t xml:space="preserve">92.048.975</w:t>
+              <w:t>30.401.642</w:t>
             </w:r>
           </w:p>
         </w:tc>
@@ -1893,7 +1893,7 @@
                 <w:szCs w:val="14"/>
                 <w:rtl w:val="0"/>
               </w:rPr>
-              <w:t xml:space="preserve">92.049.876</w:t>
+              <w:t>92.049.876</w:t>
             </w:r>
           </w:p>
         </w:tc>
@@ -1959,7 +1959,7 @@
                 <w:szCs w:val="14"/>
                 <w:rtl w:val="0"/>
               </w:rPr>
-              <w:t xml:space="preserve">92.049.876</w:t>
+              <w:t>92.137.857</w:t>
             </w:r>
           </w:p>
         </w:tc>
@@ -2056,7 +2056,7 @@
                 <w:szCs w:val="14"/>
                 <w:rtl w:val="0"/>
               </w:rPr>
-              <w:t xml:space="preserve">92.110.940</w:t>
+              <w:t>92.110.940</w:t>
             </w:r>
           </w:p>
         </w:tc>
@@ -2122,7 +2122,7 @@
                 <w:szCs w:val="14"/>
                 <w:rtl w:val="0"/>
               </w:rPr>
-              <w:t xml:space="preserve">92.110.940</w:t>
+              <w:t>92.077.665</w:t>
             </w:r>
           </w:p>
         </w:tc>
@@ -2219,7 +2219,7 @@
                 <w:szCs w:val="14"/>
                 <w:rtl w:val="0"/>
               </w:rPr>
-              <w:t xml:space="preserve">92.110.940</w:t>
+              <w:t>92.110.940</w:t>
             </w:r>
           </w:p>
         </w:tc>
@@ -2285,7 +2285,7 @@
                 <w:szCs w:val="14"/>
                 <w:rtl w:val="0"/>
               </w:rPr>
-              <w:t xml:space="preserve">92.110.940</w:t>
+              <w:t>92.077.665</w:t>
             </w:r>
           </w:p>
         </w:tc>
@@ -2382,7 +2382,7 @@
                 <w:szCs w:val="14"/>
                 <w:rtl w:val="0"/>
               </w:rPr>
-              <w:t xml:space="preserve">92.077.665</w:t>
+              <w:t>92.077.665</w:t>
             </w:r>
           </w:p>
         </w:tc>
@@ -2448,7 +2448,7 @@
                 <w:szCs w:val="14"/>
                 <w:rtl w:val="0"/>
               </w:rPr>
-              <w:t xml:space="preserve">92.077.665</w:t>
+              <w:t>92.138.226</w:t>
             </w:r>
           </w:p>
         </w:tc>
@@ -2545,7 +2545,7 @@
                 <w:szCs w:val="14"/>
                 <w:rtl w:val="0"/>
               </w:rPr>
-              <w:t xml:space="preserve">92.077.665</w:t>
+              <w:t>92.077.665</w:t>
             </w:r>
           </w:p>
         </w:tc>
@@ -2611,7 +2611,7 @@
                 <w:szCs w:val="14"/>
                 <w:rtl w:val="0"/>
               </w:rPr>
-              <w:t xml:space="preserve">92.077.665</w:t>
+              <w:t>92.138.226</w:t>
             </w:r>
           </w:p>
         </w:tc>
@@ -2708,7 +2708,7 @@
                 <w:szCs w:val="14"/>
                 <w:rtl w:val="0"/>
               </w:rPr>
-              <w:t xml:space="preserve">92.077.665</w:t>
+              <w:t>92.077.665</w:t>
             </w:r>
           </w:p>
         </w:tc>
@@ -2774,7 +2774,7 @@
                 <w:szCs w:val="14"/>
                 <w:rtl w:val="0"/>
               </w:rPr>
-              <w:t xml:space="preserve">92.077.665</w:t>
+              <w:t>92.138.226</w:t>
             </w:r>
           </w:p>
         </w:tc>
@@ -2871,7 +2871,7 @@
                 <w:szCs w:val="14"/>
                 <w:rtl w:val="0"/>
               </w:rPr>
-              <w:t xml:space="preserve">92.077.665</w:t>
+              <w:t>92.077.665</w:t>
             </w:r>
           </w:p>
         </w:tc>
@@ -2937,7 +2937,7 @@
                 <w:szCs w:val="14"/>
                 <w:rtl w:val="0"/>
               </w:rPr>
-              <w:t xml:space="preserve">92.077.665</w:t>
+              <w:t>92.138.226</w:t>
             </w:r>
           </w:p>
         </w:tc>
@@ -3034,7 +3034,7 @@
                 <w:szCs w:val="14"/>
                 <w:rtl w:val="0"/>
               </w:rPr>
-              <w:t xml:space="preserve">92.077.962</w:t>
+              <w:t>92.077.962</w:t>
             </w:r>
           </w:p>
         </w:tc>
@@ -3100,7 +3100,7 @@
                 <w:szCs w:val="14"/>
                 <w:rtl w:val="0"/>
               </w:rPr>
-              <w:t xml:space="preserve">92.077.962</w:t>
+              <w:t>92.077.665</w:t>
             </w:r>
           </w:p>
         </w:tc>

</xml_diff>